<commit_message>
Record successful same-camera prompt comparison
</commit_message>
<xml_diff>
--- a/docs/charswap-evidence/minimax-top-three-2026-10-19.docx
+++ b/docs/charswap-evidence/minimax-top-three-2026-10-19.docx
@@ -934,6 +934,93 @@
         <w:t>Prompt SHA256 02affd02a10b3ca5b06a86606b1c739b68240530c27a63266b7a0e2b478eaf8d</w:t>
       </w:r>
     </w:p>
+    <w:p>
+      <w:r>
+        <w:br w:type="page"/>
+      </w:r>
+    </w:p>
+    <w:p>
+      <w:pPr>
+        <w:pStyle w:val="Title"/>
+      </w:pPr>
+      <w:r>
+        <w:t>Follow up Same camera wording</w:t>
+      </w:r>
+    </w:p>
+    <w:p>
+      <w:pPr>
+        <w:pStyle w:val="Subtitle"/>
+      </w:pPr>
+      <w:r>
+        <w:t>October 20 2026</w:t>
+      </w:r>
+    </w:p>
+    <w:p>
+      <w:r>
+        <w:t>Frank reviewed the new result and said, "it looks actually pretty good." This records a positive review of the follow-up experiment; it does not replace or rerank the original top-three shortlist.</w:t>
+      </w:r>
+    </w:p>
+    <w:p>
+      <w:pPr>
+        <w:pStyle w:val="Heading1"/>
+      </w:pPr>
+      <w:r>
+        <w:t>Changes in this test</w:t>
+      </w:r>
+    </w:p>
+    <w:p>
+      <w:r>
+        <w:t>The structured identity-transfer prompt from the preceding experiment was retained, with one sentence added at the end of detailed_description:</w:t>
+      </w:r>
+    </w:p>
+    <w:p>
+      <w:r>
+        <w:t>All replacement performers should look as though they were filmed in the original scene with the same camera.</w:t>
+      </w:r>
+    </w:p>
+    <w:p>
+      <w:r>
+        <w:t>Frank also reassigned the five reference photos: Source A to reference 4, B to 5, C to 1, D to 3, and E to 2. Because pairings changed too, this result does not isolate the effect of the added sentence.</w:t>
+      </w:r>
+    </w:p>
+    <w:p>
+      <w:pPr>
+        <w:pStyle w:val="Heading1"/>
+      </w:pPr>
+      <w:r>
+        <w:t>Settings and delivery</w:t>
+      </w:r>
+    </w:p>
+    <w:p>
+      <w:r>
+        <w:t>MiniMax H3 through reAPI; 15 seconds; 768P; shared cyan overlay at 20% color opacity; face mesh on; depth off. The guide and reference files are byte-identical to those used by the preceding structured identity-transfer test. Only the assignments and prompt sentence changed.</w:t>
+      </w:r>
+    </w:p>
+    <w:p>
+      <w:r>
+        <w:t>One render was submitted. The supplier charge was US$1.097, with completion observed after 673.7 seconds. The result is 1024 by 768 and approximately 15.083 seconds. The large lower-right recastfx.com watermark was added locally after generation, with coral fx and white remaining lettering. The watermark did not affect model input; the returned audio was preserved.</w:t>
+      </w:r>
+    </w:p>
+    <w:p>
+      <w:hyperlink r:id="rId17">
+        <w:r>
+          <w:rPr>
+            <w:rStyle w:val="Hyperlink"/>
+          </w:rPr>
+          <w:t>Open the new watermarked result</w:t>
+        </w:r>
+      </w:hyperlink>
+    </w:p>
+    <w:p>
+      <w:hyperlink r:id="rId18">
+        <w:r>
+          <w:rPr>
+            <w:rStyle w:val="Hyperlink"/>
+          </w:rPr>
+          <w:t>Open the exact submitted guide with face mesh</w:t>
+        </w:r>
+      </w:hyperlink>
+    </w:p>
     <w:sectPr>
       <w:pgSz w:w="12240" w:h="15840"/>
       <w:pgMar w:top="936" w:right="1080" w:bottom="936" w:left="1080" w:header="720" w:footer="720" w:gutter="0"/>

</xml_diff>